<commit_message>
reduce the latency and enlarege the dem clk
1. reduce the latency of the tll to 12
2. enlarege the dem clk of symbol rate * 3
</commit_message>
<xml_diff>
--- a/doc/log_hs_dem.docx
+++ b/doc/log_hs_dem.docx
@@ -977,6 +977,9 @@
     <w:p/>
     <w:p>
       <w:r>
+        <w:rPr>
+          <w:noProof/>
+        </w:rPr>
         <w:drawing>
           <wp:inline distT="0" distB="0" distL="0" distR="0" wp14:anchorId="3E36CC7E" wp14:editId="72EDD920">
             <wp:extent cx="5274310" cy="753745"/>
@@ -1015,12 +1018,10 @@
       </w:r>
     </w:p>
     <w:p>
-      <w:pPr>
-        <w:rPr>
-          <w:rFonts w:hint="eastAsia"/>
-        </w:rPr>
-      </w:pPr>
-      <w:r>
+      <w:r>
+        <w:rPr>
+          <w:noProof/>
+        </w:rPr>
         <w:lastRenderedPageBreak/>
         <w:drawing>
           <wp:inline distT="0" distB="0" distL="0" distR="0" wp14:anchorId="2E4E0761" wp14:editId="72CB50FC">
@@ -1392,12 +1393,10 @@
       </w:r>
     </w:p>
     <w:p>
-      <w:pPr>
-        <w:rPr>
-          <w:rFonts w:hint="eastAsia"/>
-        </w:rPr>
-      </w:pPr>
-      <w:r>
+      <w:r>
+        <w:rPr>
+          <w:noProof/>
+        </w:rPr>
         <w:drawing>
           <wp:inline distT="0" distB="0" distL="0" distR="0" wp14:anchorId="1AFDC680" wp14:editId="2CD3CCC5">
             <wp:extent cx="5274310" cy="560070"/>
@@ -1437,6 +1436,9 @@
     </w:p>
     <w:p>
       <w:r>
+        <w:rPr>
+          <w:noProof/>
+        </w:rPr>
         <w:lastRenderedPageBreak/>
         <w:drawing>
           <wp:inline distT="0" distB="0" distL="0" distR="0" wp14:anchorId="5E5A04B3" wp14:editId="5D9EC786">
@@ -1476,11 +1478,6 @@
       </w:r>
     </w:p>
     <w:p>
-      <w:pPr>
-        <w:rPr>
-          <w:rFonts w:hint="eastAsia"/>
-        </w:rPr>
-      </w:pPr>
       <w:r>
         <w:rPr>
           <w:rFonts w:hint="eastAsia"/>
@@ -1538,6 +1535,9 @@
     </w:p>
     <w:p>
       <w:r>
+        <w:rPr>
+          <w:noProof/>
+        </w:rPr>
         <w:drawing>
           <wp:inline distT="0" distB="0" distL="0" distR="0" wp14:anchorId="64B6777A" wp14:editId="49D3BFC1">
             <wp:extent cx="5274310" cy="2723515"/>
@@ -1604,10 +1604,59 @@
     </w:p>
     <w:p>
       <w:pPr>
-        <w:rPr>
-          <w:rFonts w:hint="eastAsia"/>
-        </w:rPr>
+        <w:pStyle w:val="1"/>
       </w:pPr>
+      <w:r>
+        <w:rPr>
+          <w:rFonts w:hint="eastAsia"/>
+        </w:rPr>
+        <w:lastRenderedPageBreak/>
+        <w:t>2026/4/24</w:t>
+      </w:r>
+    </w:p>
+    <w:p>
+      <w:pPr>
+        <w:rPr>
+          <w:rFonts w:hint="eastAsia"/>
+        </w:rPr>
+      </w:pPr>
+      <w:r>
+        <w:drawing>
+          <wp:inline distT="0" distB="0" distL="0" distR="0" wp14:anchorId="2CBAF20B" wp14:editId="7B885508">
+            <wp:extent cx="5274310" cy="1655445"/>
+            <wp:effectExtent l="0" t="0" r="2540" b="1905"/>
+            <wp:docPr id="1836974718" name="图片 1"/>
+            <wp:cNvGraphicFramePr>
+              <a:graphicFrameLocks xmlns:a="http://schemas.openxmlformats.org/drawingml/2006/main" noChangeAspect="1"/>
+            </wp:cNvGraphicFramePr>
+            <a:graphic xmlns:a="http://schemas.openxmlformats.org/drawingml/2006/main">
+              <a:graphicData uri="http://schemas.openxmlformats.org/drawingml/2006/picture">
+                <pic:pic xmlns:pic="http://schemas.openxmlformats.org/drawingml/2006/picture">
+                  <pic:nvPicPr>
+                    <pic:cNvPr id="1836974718" name=""/>
+                    <pic:cNvPicPr/>
+                  </pic:nvPicPr>
+                  <pic:blipFill>
+                    <a:blip r:embed="rId31"/>
+                    <a:stretch>
+                      <a:fillRect/>
+                    </a:stretch>
+                  </pic:blipFill>
+                  <pic:spPr>
+                    <a:xfrm>
+                      <a:off x="0" y="0"/>
+                      <a:ext cx="5274310" cy="1655445"/>
+                    </a:xfrm>
+                    <a:prstGeom prst="rect">
+                      <a:avLst/>
+                    </a:prstGeom>
+                  </pic:spPr>
+                </pic:pic>
+              </a:graphicData>
+            </a:graphic>
+          </wp:inline>
+        </w:drawing>
+      </w:r>
     </w:p>
     <w:sectPr>
       <w:pgSz w:w="11906" w:h="16838"/>

</xml_diff>

<commit_message>
update doc and rst tll
</commit_message>
<xml_diff>
--- a/doc/log_hs_dem.docx
+++ b/doc/log_hs_dem.docx
@@ -3,6 +3,9 @@
 <w:document xmlns:wpc="http://schemas.microsoft.com/office/word/2010/wordprocessingCanvas" xmlns:cx="http://schemas.microsoft.com/office/drawing/2014/chartex" xmlns:cx1="http://schemas.microsoft.com/office/drawing/2015/9/8/chartex" xmlns:cx2="http://schemas.microsoft.com/office/drawing/2015/10/21/chartex" xmlns:cx3="http://schemas.microsoft.com/office/drawing/2016/5/9/chartex" xmlns:cx4="http://schemas.microsoft.com/office/drawing/2016/5/10/chartex" xmlns:cx5="http://schemas.microsoft.com/office/drawing/2016/5/11/chartex" xmlns:cx6="http://schemas.microsoft.com/office/drawing/2016/5/12/chartex" xmlns:cx7="http://schemas.microsoft.com/office/drawing/2016/5/13/chartex" xmlns:cx8="http://schemas.microsoft.com/office/drawing/2016/5/14/chartex" xmlns:mc="http://schemas.openxmlformats.org/markup-compatibility/2006" xmlns:aink="http://schemas.microsoft.com/office/drawing/2016/ink" xmlns:am3d="http://schemas.microsoft.com/office/drawing/2017/model3d" xmlns:o="urn:schemas-microsoft-com:office:office" xmlns:oel="http://schemas.microsoft.com/office/2019/extlst" xmlns:r="http://schemas.openxmlformats.org/officeDocument/2006/relationships" xmlns:m="http://schemas.openxmlformats.org/officeDocument/2006/math" xmlns:v="urn:schemas-microsoft-com:vml" xmlns:wp14="http://schemas.microsoft.com/office/word/2010/wordprocessingDrawing" xmlns:wp="http://schemas.openxmlformats.org/drawingml/2006/wordprocessingDrawing" xmlns:w10="urn:schemas-microsoft-com:office:word" xmlns:w="http://schemas.openxmlformats.org/wordprocessingml/2006/main" xmlns:w14="http://schemas.microsoft.com/office/word/2010/wordml" xmlns:w15="http://schemas.microsoft.com/office/word/2012/wordml" xmlns:w16cex="http://schemas.microsoft.com/office/word/2018/wordml/cex" xmlns:w16cid="http://schemas.microsoft.com/office/word/2016/wordml/cid" xmlns:w16="http://schemas.microsoft.com/office/word/2018/wordml" xmlns:w16du="http://schemas.microsoft.com/office/word/2023/wordml/word16du" xmlns:w16sdtdh="http://schemas.microsoft.com/office/word/2020/wordml/sdtdatahash" xmlns:w16sdtfl="http://schemas.microsoft.com/office/word/2024/wordml/sdtformatlock" xmlns:w16se="http://schemas.microsoft.com/office/word/2015/wordml/symex" xmlns:wpg="http://schemas.microsoft.com/office/word/2010/wordprocessingGroup" xmlns:wpi="http://schemas.microsoft.com/office/word/2010/wordprocessingInk" xmlns:wne="http://schemas.microsoft.com/office/word/2006/wordml" xmlns:wps="http://schemas.microsoft.com/office/word/2010/wordprocessingShape" mc:Ignorable="w14 w15 w16se w16cid w16 w16cex w16sdtdh w16sdtfl w16du wp14">
   <w:body>
     <w:p>
+      <w:pPr>
+        <w:pStyle w:val="1"/>
+      </w:pPr>
       <w:r>
         <w:rPr>
           <w:rFonts w:hint="eastAsia"/>
@@ -41,12 +44,14 @@
         </w:rPr>
         <w:t>）的波形，进行仿真，</w:t>
       </w:r>
+      <w:proofErr w:type="spellStart"/>
       <w:r>
         <w:rPr>
           <w:rFonts w:hint="eastAsia"/>
         </w:rPr>
         <w:t>modelsim</w:t>
       </w:r>
+      <w:proofErr w:type="spellEnd"/>
       <w:r>
         <w:rPr>
           <w:rFonts w:hint="eastAsia"/>
@@ -248,12 +253,14 @@
         </w:rPr>
         <w:t>的数据导出来，用</w:t>
       </w:r>
+      <w:proofErr w:type="spellStart"/>
       <w:r>
         <w:rPr>
           <w:rFonts w:hint="eastAsia"/>
         </w:rPr>
         <w:t>matlab</w:t>
       </w:r>
+      <w:proofErr w:type="spellEnd"/>
       <w:r>
         <w:rPr>
           <w:rFonts w:hint="eastAsia"/>
@@ -269,12 +276,14 @@
         </w:rPr>
         <w:t>还需要增加状态机。在</w:t>
       </w:r>
+      <w:proofErr w:type="spellStart"/>
       <w:r>
         <w:rPr>
           <w:rFonts w:hint="eastAsia"/>
         </w:rPr>
         <w:t>agc</w:t>
       </w:r>
+      <w:proofErr w:type="spellEnd"/>
       <w:r>
         <w:rPr>
           <w:rFonts w:hint="eastAsia"/>
@@ -315,7 +324,21 @@
         <w:rPr>
           <w:rFonts w:hint="eastAsia"/>
         </w:rPr>
-        <w:t>。如果长时间不锁定，就复位。</w:t>
+        <w:t>。如果长时间</w:t>
+      </w:r>
+      <w:proofErr w:type="gramStart"/>
+      <w:r>
+        <w:rPr>
+          <w:rFonts w:hint="eastAsia"/>
+        </w:rPr>
+        <w:t>不</w:t>
+      </w:r>
+      <w:proofErr w:type="gramEnd"/>
+      <w:r>
+        <w:rPr>
+          <w:rFonts w:hint="eastAsia"/>
+        </w:rPr>
+        <w:t>锁定，就复位。</w:t>
       </w:r>
     </w:p>
     <w:p>
@@ -1615,12 +1638,10 @@
       </w:r>
     </w:p>
     <w:p>
-      <w:pPr>
-        <w:rPr>
-          <w:rFonts w:hint="eastAsia"/>
-        </w:rPr>
-      </w:pPr>
-      <w:r>
+      <w:r>
+        <w:rPr>
+          <w:noProof/>
+        </w:rPr>
         <w:drawing>
           <wp:inline distT="0" distB="0" distL="0" distR="0" wp14:anchorId="2CBAF20B" wp14:editId="7B885508">
             <wp:extent cx="5274310" cy="1655445"/>
@@ -1657,6 +1678,230 @@
           </wp:inline>
         </w:drawing>
       </w:r>
+    </w:p>
+    <w:p>
+      <w:r>
+        <w:rPr>
+          <w:rFonts w:hint="eastAsia"/>
+        </w:rPr>
+        <w:t>输出时序</w:t>
+      </w:r>
+    </w:p>
+    <w:p>
+      <w:pPr>
+        <w:rPr>
+          <w:rFonts w:hint="eastAsia"/>
+        </w:rPr>
+      </w:pPr>
+    </w:p>
+    <w:p>
+      <w:r>
+        <w:drawing>
+          <wp:inline distT="0" distB="0" distL="0" distR="0" wp14:anchorId="6BB2C328" wp14:editId="7BFB2318">
+            <wp:extent cx="5274310" cy="421640"/>
+            <wp:effectExtent l="0" t="0" r="2540" b="0"/>
+            <wp:docPr id="1896677966" name="图片 1"/>
+            <wp:cNvGraphicFramePr>
+              <a:graphicFrameLocks xmlns:a="http://schemas.openxmlformats.org/drawingml/2006/main" noChangeAspect="1"/>
+            </wp:cNvGraphicFramePr>
+            <a:graphic xmlns:a="http://schemas.openxmlformats.org/drawingml/2006/main">
+              <a:graphicData uri="http://schemas.openxmlformats.org/drawingml/2006/picture">
+                <pic:pic xmlns:pic="http://schemas.openxmlformats.org/drawingml/2006/picture">
+                  <pic:nvPicPr>
+                    <pic:cNvPr id="1896677966" name=""/>
+                    <pic:cNvPicPr/>
+                  </pic:nvPicPr>
+                  <pic:blipFill>
+                    <a:blip r:embed="rId32"/>
+                    <a:stretch>
+                      <a:fillRect/>
+                    </a:stretch>
+                  </pic:blipFill>
+                  <pic:spPr>
+                    <a:xfrm>
+                      <a:off x="0" y="0"/>
+                      <a:ext cx="5274310" cy="421640"/>
+                    </a:xfrm>
+                    <a:prstGeom prst="rect">
+                      <a:avLst/>
+                    </a:prstGeom>
+                  </pic:spPr>
+                </pic:pic>
+              </a:graphicData>
+            </a:graphic>
+          </wp:inline>
+        </w:drawing>
+      </w:r>
+    </w:p>
+    <w:p/>
+    <w:p/>
+    <w:p>
+      <w:r>
+        <w:rPr>
+          <w:rFonts w:hint="eastAsia"/>
+        </w:rPr>
+        <w:t>给</w:t>
+      </w:r>
+      <w:r>
+        <w:rPr>
+          <w:rFonts w:hint="eastAsia"/>
+        </w:rPr>
+        <w:t>-20dBm</w:t>
+      </w:r>
+      <w:r>
+        <w:rPr>
+          <w:rFonts w:hint="eastAsia"/>
+        </w:rPr>
+        <w:t>进行测试</w:t>
+      </w:r>
+    </w:p>
+    <w:p>
+      <w:r>
+        <w:drawing>
+          <wp:inline distT="0" distB="0" distL="0" distR="0" wp14:anchorId="50FFA4F8" wp14:editId="7A68AFD5">
+            <wp:extent cx="3994355" cy="4007056"/>
+            <wp:effectExtent l="0" t="0" r="6350" b="0"/>
+            <wp:docPr id="68575374" name="图片 1"/>
+            <wp:cNvGraphicFramePr>
+              <a:graphicFrameLocks xmlns:a="http://schemas.openxmlformats.org/drawingml/2006/main" noChangeAspect="1"/>
+            </wp:cNvGraphicFramePr>
+            <a:graphic xmlns:a="http://schemas.openxmlformats.org/drawingml/2006/main">
+              <a:graphicData uri="http://schemas.openxmlformats.org/drawingml/2006/picture">
+                <pic:pic xmlns:pic="http://schemas.openxmlformats.org/drawingml/2006/picture">
+                  <pic:nvPicPr>
+                    <pic:cNvPr id="68575374" name=""/>
+                    <pic:cNvPicPr/>
+                  </pic:nvPicPr>
+                  <pic:blipFill>
+                    <a:blip r:embed="rId33"/>
+                    <a:stretch>
+                      <a:fillRect/>
+                    </a:stretch>
+                  </pic:blipFill>
+                  <pic:spPr>
+                    <a:xfrm>
+                      <a:off x="0" y="0"/>
+                      <a:ext cx="3994355" cy="4007056"/>
+                    </a:xfrm>
+                    <a:prstGeom prst="rect">
+                      <a:avLst/>
+                    </a:prstGeom>
+                  </pic:spPr>
+                </pic:pic>
+              </a:graphicData>
+            </a:graphic>
+          </wp:inline>
+        </w:drawing>
+      </w:r>
+    </w:p>
+    <w:p>
+      <w:r>
+        <w:rPr>
+          <w:rFonts w:hint="eastAsia"/>
+        </w:rPr>
+        <w:t>给</w:t>
+      </w:r>
+      <w:r>
+        <w:rPr>
+          <w:rFonts w:hint="eastAsia"/>
+        </w:rPr>
+        <w:t>-</w:t>
+      </w:r>
+      <w:r>
+        <w:rPr>
+          <w:rFonts w:hint="eastAsia"/>
+        </w:rPr>
+        <w:t>3</w:t>
+      </w:r>
+      <w:r>
+        <w:rPr>
+          <w:rFonts w:hint="eastAsia"/>
+        </w:rPr>
+        <w:t>0dBm</w:t>
+      </w:r>
+      <w:r>
+        <w:rPr>
+          <w:rFonts w:hint="eastAsia"/>
+        </w:rPr>
+        <w:t>进行测试</w:t>
+      </w:r>
+    </w:p>
+    <w:p>
+      <w:r>
+        <w:lastRenderedPageBreak/>
+        <w:drawing>
+          <wp:inline distT="0" distB="0" distL="0" distR="0" wp14:anchorId="23E7E673" wp14:editId="128080C7">
+            <wp:extent cx="3886400" cy="3918151"/>
+            <wp:effectExtent l="0" t="0" r="0" b="6350"/>
+            <wp:docPr id="1314054706" name="图片 1"/>
+            <wp:cNvGraphicFramePr>
+              <a:graphicFrameLocks xmlns:a="http://schemas.openxmlformats.org/drawingml/2006/main" noChangeAspect="1"/>
+            </wp:cNvGraphicFramePr>
+            <a:graphic xmlns:a="http://schemas.openxmlformats.org/drawingml/2006/main">
+              <a:graphicData uri="http://schemas.openxmlformats.org/drawingml/2006/picture">
+                <pic:pic xmlns:pic="http://schemas.openxmlformats.org/drawingml/2006/picture">
+                  <pic:nvPicPr>
+                    <pic:cNvPr id="1314054706" name=""/>
+                    <pic:cNvPicPr/>
+                  </pic:nvPicPr>
+                  <pic:blipFill>
+                    <a:blip r:embed="rId34"/>
+                    <a:stretch>
+                      <a:fillRect/>
+                    </a:stretch>
+                  </pic:blipFill>
+                  <pic:spPr>
+                    <a:xfrm>
+                      <a:off x="0" y="0"/>
+                      <a:ext cx="3886400" cy="3918151"/>
+                    </a:xfrm>
+                    <a:prstGeom prst="rect">
+                      <a:avLst/>
+                    </a:prstGeom>
+                  </pic:spPr>
+                </pic:pic>
+              </a:graphicData>
+            </a:graphic>
+          </wp:inline>
+        </w:drawing>
+      </w:r>
+    </w:p>
+    <w:p>
+      <w:r>
+        <w:rPr>
+          <w:rFonts w:hint="eastAsia"/>
+        </w:rPr>
+        <w:t>给</w:t>
+      </w:r>
+      <w:r>
+        <w:rPr>
+          <w:rFonts w:hint="eastAsia"/>
+        </w:rPr>
+        <w:t>-40dBm</w:t>
+      </w:r>
+    </w:p>
+    <w:p>
+      <w:r>
+        <w:rPr>
+          <w:rFonts w:hint="eastAsia"/>
+        </w:rPr>
+        <w:t>就不触发了</w:t>
+      </w:r>
+    </w:p>
+    <w:p>
+      <w:r>
+        <w:rPr>
+          <w:rFonts w:hint="eastAsia"/>
+        </w:rPr>
+        <w:t>不满足触发功率触发条件了</w:t>
+      </w:r>
+    </w:p>
+    <w:p>
+      <w:pPr>
+        <w:rPr>
+          <w:rFonts w:hint="eastAsia"/>
+        </w:rPr>
+      </w:pPr>
     </w:p>
     <w:sectPr>
       <w:pgSz w:w="11906" w:h="16838"/>
@@ -2009,7 +2254,7 @@
   <w:style w:type="paragraph" w:default="1" w:styleId="a">
     <w:name w:val="Normal"/>
     <w:qFormat/>
-    <w:rsid w:val="000A6E4E"/>
+    <w:rsid w:val="006E2827"/>
     <w:pPr>
       <w:widowControl w:val="0"/>
       <w:jc w:val="both"/>

</xml_diff>

<commit_message>
change dem threshold for wb and nb demodulator
1. noise: 0x4e20 -> 0x20;
2. tll: 0x300 -> 0x350
</commit_message>
<xml_diff>
--- a/doc/log_hs_dem.docx
+++ b/doc/log_hs_dem.docx
@@ -1,6 +1,6 @@
 
 <file path=word/document.xml><?xml version="1.0" encoding="utf-8"?>
-<w:document xmlns:wpc="http://schemas.microsoft.com/office/word/2010/wordprocessingCanvas" xmlns:cx="http://schemas.microsoft.com/office/drawing/2014/chartex" xmlns:cx1="http://schemas.microsoft.com/office/drawing/2015/9/8/chartex" xmlns:cx2="http://schemas.microsoft.com/office/drawing/2015/10/21/chartex" xmlns:cx3="http://schemas.microsoft.com/office/drawing/2016/5/9/chartex" xmlns:cx4="http://schemas.microsoft.com/office/drawing/2016/5/10/chartex" xmlns:cx5="http://schemas.microsoft.com/office/drawing/2016/5/11/chartex" xmlns:cx6="http://schemas.microsoft.com/office/drawing/2016/5/12/chartex" xmlns:cx7="http://schemas.microsoft.com/office/drawing/2016/5/13/chartex" xmlns:cx8="http://schemas.microsoft.com/office/drawing/2016/5/14/chartex" xmlns:mc="http://schemas.openxmlformats.org/markup-compatibility/2006" xmlns:aink="http://schemas.microsoft.com/office/drawing/2016/ink" xmlns:am3d="http://schemas.microsoft.com/office/drawing/2017/model3d" xmlns:o="urn:schemas-microsoft-com:office:office" xmlns:oel="http://schemas.microsoft.com/office/2019/extlst" xmlns:r="http://schemas.openxmlformats.org/officeDocument/2006/relationships" xmlns:m="http://schemas.openxmlformats.org/officeDocument/2006/math" xmlns:v="urn:schemas-microsoft-com:vml" xmlns:wp14="http://schemas.microsoft.com/office/word/2010/wordprocessingDrawing" xmlns:wp="http://schemas.openxmlformats.org/drawingml/2006/wordprocessingDrawing" xmlns:w10="urn:schemas-microsoft-com:office:word" xmlns:w="http://schemas.openxmlformats.org/wordprocessingml/2006/main" xmlns:w14="http://schemas.microsoft.com/office/word/2010/wordml" xmlns:w15="http://schemas.microsoft.com/office/word/2012/wordml" xmlns:w16cex="http://schemas.microsoft.com/office/word/2018/wordml/cex" xmlns:w16cid="http://schemas.microsoft.com/office/word/2016/wordml/cid" xmlns:w16="http://schemas.microsoft.com/office/word/2018/wordml" xmlns:w16du="http://schemas.microsoft.com/office/word/2023/wordml/word16du" xmlns:w16sdtdh="http://schemas.microsoft.com/office/word/2020/wordml/sdtdatahash" xmlns:w16sdtfl="http://schemas.microsoft.com/office/word/2024/wordml/sdtformatlock" xmlns:w16se="http://schemas.microsoft.com/office/word/2015/wordml/symex" xmlns:wpg="http://schemas.microsoft.com/office/word/2010/wordprocessingGroup" xmlns:wpi="http://schemas.microsoft.com/office/word/2010/wordprocessingInk" xmlns:wne="http://schemas.microsoft.com/office/word/2006/wordml" xmlns:wps="http://schemas.microsoft.com/office/word/2010/wordprocessingShape" mc:Ignorable="w14 w15 w16se w16cid w16 w16cex w16sdtdh w16sdtfl w16du wp14">
+<w:document xmlns:wpc="http://schemas.microsoft.com/office/word/2010/wordprocessingCanvas" xmlns:cx="http://schemas.microsoft.com/office/drawing/2014/chartex" xmlns:cx1="http://schemas.microsoft.com/office/drawing/2015/9/8/chartex" xmlns:cx2="http://schemas.microsoft.com/office/drawing/2015/10/21/chartex" xmlns:cx3="http://schemas.microsoft.com/office/drawing/2016/5/9/chartex" xmlns:cx4="http://schemas.microsoft.com/office/drawing/2016/5/10/chartex" xmlns:cx5="http://schemas.microsoft.com/office/drawing/2016/5/11/chartex" xmlns:cx6="http://schemas.microsoft.com/office/drawing/2016/5/12/chartex" xmlns:cx7="http://schemas.microsoft.com/office/drawing/2016/5/13/chartex" xmlns:cx8="http://schemas.microsoft.com/office/drawing/2016/5/14/chartex" xmlns:mc="http://schemas.openxmlformats.org/markup-compatibility/2006" xmlns:aink="http://schemas.microsoft.com/office/drawing/2016/ink" xmlns:am3d="http://schemas.microsoft.com/office/drawing/2017/model3d" xmlns:o="urn:schemas-microsoft-com:office:office" xmlns:oel="http://schemas.microsoft.com/office/2019/extlst" xmlns:r="http://schemas.openxmlformats.org/officeDocument/2006/relationships" xmlns:m="http://schemas.openxmlformats.org/officeDocument/2006/math" xmlns:v="urn:schemas-microsoft-com:vml" xmlns:wp14="http://schemas.microsoft.com/office/word/2010/wordprocessingDrawing" xmlns:wp="http://schemas.openxmlformats.org/drawingml/2006/wordprocessingDrawing" xmlns:w10="urn:schemas-microsoft-com:office:word" xmlns:w="http://schemas.openxmlformats.org/wordprocessingml/2006/main" xmlns:w14="http://schemas.microsoft.com/office/word/2010/wordml" xmlns:w15="http://schemas.microsoft.com/office/word/2012/wordml" xmlns:w16cei="http://schemas.microsoft.com/office/word/2026/wordml/cei" xmlns:w16cex="http://schemas.microsoft.com/office/word/2018/wordml/cex" xmlns:w16cid="http://schemas.microsoft.com/office/word/2016/wordml/cid" xmlns:w16="http://schemas.microsoft.com/office/word/2018/wordml" xmlns:w16du="http://schemas.microsoft.com/office/word/2023/wordml/word16du" xmlns:w16sdtdh="http://schemas.microsoft.com/office/word/2020/wordml/sdtdatahash" xmlns:w16sdtfl="http://schemas.microsoft.com/office/word/2024/wordml/sdtformatlock" xmlns:w16se="http://schemas.microsoft.com/office/word/2015/wordml/symex" xmlns:wpg="http://schemas.microsoft.com/office/word/2010/wordprocessingGroup" xmlns:wpi="http://schemas.microsoft.com/office/word/2010/wordprocessingInk" xmlns:wne="http://schemas.microsoft.com/office/word/2006/wordml" xmlns:wps="http://schemas.microsoft.com/office/word/2010/wordprocessingShape" mc:Ignorable="w14 w15 w16se w16cid w16 w16cex w16sdtdh w16sdtfl w16du wp14">
   <w:body>
     <w:p>
       <w:pPr>
@@ -44,14 +44,12 @@
         </w:rPr>
         <w:t>）的波形，进行仿真，</w:t>
       </w:r>
-      <w:proofErr w:type="spellStart"/>
       <w:r>
         <w:rPr>
           <w:rFonts w:hint="eastAsia"/>
         </w:rPr>
         <w:t>modelsim</w:t>
       </w:r>
-      <w:proofErr w:type="spellEnd"/>
       <w:r>
         <w:rPr>
           <w:rFonts w:hint="eastAsia"/>
@@ -253,14 +251,12 @@
         </w:rPr>
         <w:t>的数据导出来，用</w:t>
       </w:r>
-      <w:proofErr w:type="spellStart"/>
       <w:r>
         <w:rPr>
           <w:rFonts w:hint="eastAsia"/>
         </w:rPr>
         <w:t>matlab</w:t>
       </w:r>
-      <w:proofErr w:type="spellEnd"/>
       <w:r>
         <w:rPr>
           <w:rFonts w:hint="eastAsia"/>
@@ -276,14 +272,12 @@
         </w:rPr>
         <w:t>还需要增加状态机。在</w:t>
       </w:r>
-      <w:proofErr w:type="spellStart"/>
       <w:r>
         <w:rPr>
           <w:rFonts w:hint="eastAsia"/>
         </w:rPr>
         <w:t>agc</w:t>
       </w:r>
-      <w:proofErr w:type="spellEnd"/>
       <w:r>
         <w:rPr>
           <w:rFonts w:hint="eastAsia"/>
@@ -1602,14 +1596,7 @@
         <w:rPr>
           <w:rFonts w:hint="eastAsia"/>
         </w:rPr>
-        <w:t>跟踪速率太</w:t>
-      </w:r>
-      <w:proofErr w:type="gramStart"/>
-      <w:r>
-        <w:rPr>
-          <w:rFonts w:hint="eastAsia"/>
-        </w:rPr>
-        <w:t>慢！</w:t>
+        <w:t>跟踪速率太慢！</w:t>
       </w:r>
       <w:r>
         <w:rPr>
@@ -1617,7 +1604,6 @@
         </w:rPr>
         <w:t>！！</w:t>
       </w:r>
-      <w:proofErr w:type="gramEnd"/>
     </w:p>
     <w:p>
       <w:pPr>
@@ -2387,14 +2373,12 @@
         </w:rPr>
         <w:t>抓了些</w:t>
       </w:r>
-      <w:proofErr w:type="spellStart"/>
       <w:r>
         <w:rPr>
           <w:rFonts w:hint="eastAsia"/>
         </w:rPr>
         <w:t>waveiq</w:t>
       </w:r>
-      <w:proofErr w:type="spellEnd"/>
       <w:r>
         <w:rPr>
           <w:rFonts w:hint="eastAsia"/>
@@ -2705,14 +2689,12 @@
         </w:rPr>
         <w:t>符号弄倒了，导致</w:t>
       </w:r>
-      <w:proofErr w:type="spellStart"/>
       <w:r>
         <w:rPr>
           <w:rFonts w:hint="eastAsia"/>
         </w:rPr>
         <w:t>phase_in</w:t>
       </w:r>
-      <w:proofErr w:type="spellEnd"/>
       <w:r>
         <w:rPr>
           <w:rFonts w:hint="eastAsia"/>
@@ -3359,14 +3341,12 @@
         </w:rPr>
         <w:t>要修改对应的</w:t>
       </w:r>
-      <w:proofErr w:type="spellStart"/>
       <w:r>
         <w:rPr>
           <w:rFonts w:hint="eastAsia"/>
         </w:rPr>
         <w:t>CardNum</w:t>
       </w:r>
-      <w:proofErr w:type="spellEnd"/>
     </w:p>
     <w:p>
       <w:r>
@@ -3560,11 +3540,6 @@
       </w:r>
     </w:p>
     <w:p>
-      <w:pPr>
-        <w:rPr>
-          <w:rFonts w:hint="eastAsia"/>
-        </w:rPr>
-      </w:pPr>
       <w:r>
         <w:rPr>
           <w:rFonts w:hint="eastAsia"/>
@@ -3592,6 +3567,9 @@
     </w:p>
     <w:p>
       <w:r>
+        <w:rPr>
+          <w:noProof/>
+        </w:rPr>
         <w:drawing>
           <wp:inline distT="0" distB="0" distL="0" distR="0" wp14:anchorId="6FCD7ABA" wp14:editId="55F12392">
             <wp:extent cx="5274310" cy="2840990"/>
@@ -3631,7 +3609,128 @@
     </w:p>
     <w:p>
       <w:r>
+        <w:rPr>
+          <w:rFonts w:hint="eastAsia"/>
+        </w:rPr>
+        <w:t>1397MHz,1.25Msps,QPSK</w:t>
+      </w:r>
+    </w:p>
+    <w:p>
+      <w:r>
+        <w:rPr>
+          <w:rFonts w:hint="eastAsia"/>
+        </w:rPr>
+        <w:t>1330MHz,105Msps,QPSK</w:t>
+      </w:r>
+    </w:p>
+    <w:p/>
+    <w:p>
+      <w:r>
+        <w:t>F</w:t>
+      </w:r>
+      <w:r>
+        <w:rPr>
+          <w:rFonts w:hint="eastAsia"/>
+        </w:rPr>
+        <w:t>lash</w:t>
+      </w:r>
+      <w:r>
+        <w:rPr>
+          <w:rFonts w:hint="eastAsia"/>
+        </w:rPr>
+        <w:t>型号</w:t>
+      </w:r>
+    </w:p>
+    <w:p>
+      <w:r>
+        <w:rPr>
+          <w:noProof/>
+        </w:rPr>
+        <w:drawing>
+          <wp:inline distT="0" distB="0" distL="0" distR="0" wp14:anchorId="74FD2697" wp14:editId="2EBE5E6D">
+            <wp:extent cx="2457576" cy="406421"/>
+            <wp:effectExtent l="0" t="0" r="0" b="0"/>
+            <wp:docPr id="597131087" name="图片 1"/>
+            <wp:cNvGraphicFramePr>
+              <a:graphicFrameLocks xmlns:a="http://schemas.openxmlformats.org/drawingml/2006/main" noChangeAspect="1"/>
+            </wp:cNvGraphicFramePr>
+            <a:graphic xmlns:a="http://schemas.openxmlformats.org/drawingml/2006/main">
+              <a:graphicData uri="http://schemas.openxmlformats.org/drawingml/2006/picture">
+                <pic:pic xmlns:pic="http://schemas.openxmlformats.org/drawingml/2006/picture">
+                  <pic:nvPicPr>
+                    <pic:cNvPr id="597131087" name=""/>
+                    <pic:cNvPicPr/>
+                  </pic:nvPicPr>
+                  <pic:blipFill>
+                    <a:blip r:embed="rId62"/>
+                    <a:stretch>
+                      <a:fillRect/>
+                    </a:stretch>
+                  </pic:blipFill>
+                  <pic:spPr>
+                    <a:xfrm>
+                      <a:off x="0" y="0"/>
+                      <a:ext cx="2457576" cy="406421"/>
+                    </a:xfrm>
+                    <a:prstGeom prst="rect">
+                      <a:avLst/>
+                    </a:prstGeom>
+                  </pic:spPr>
+                </pic:pic>
+              </a:graphicData>
+            </a:graphic>
+          </wp:inline>
+        </w:drawing>
+      </w:r>
+    </w:p>
+    <w:p>
+      <w:r>
+        <w:rPr>
+          <w:noProof/>
+        </w:rPr>
         <w:lastRenderedPageBreak/>
+        <w:drawing>
+          <wp:inline distT="0" distB="0" distL="0" distR="0" wp14:anchorId="1ED51CCF" wp14:editId="32C5E177">
+            <wp:extent cx="5274310" cy="2280920"/>
+            <wp:effectExtent l="0" t="0" r="2540" b="5080"/>
+            <wp:docPr id="1831889901" name="图片 1"/>
+            <wp:cNvGraphicFramePr>
+              <a:graphicFrameLocks xmlns:a="http://schemas.openxmlformats.org/drawingml/2006/main" noChangeAspect="1"/>
+            </wp:cNvGraphicFramePr>
+            <a:graphic xmlns:a="http://schemas.openxmlformats.org/drawingml/2006/main">
+              <a:graphicData uri="http://schemas.openxmlformats.org/drawingml/2006/picture">
+                <pic:pic xmlns:pic="http://schemas.openxmlformats.org/drawingml/2006/picture">
+                  <pic:nvPicPr>
+                    <pic:cNvPr id="1831889901" name=""/>
+                    <pic:cNvPicPr/>
+                  </pic:nvPicPr>
+                  <pic:blipFill>
+                    <a:blip r:embed="rId63"/>
+                    <a:stretch>
+                      <a:fillRect/>
+                    </a:stretch>
+                  </pic:blipFill>
+                  <pic:spPr>
+                    <a:xfrm>
+                      <a:off x="0" y="0"/>
+                      <a:ext cx="5274310" cy="2280920"/>
+                    </a:xfrm>
+                    <a:prstGeom prst="rect">
+                      <a:avLst/>
+                    </a:prstGeom>
+                  </pic:spPr>
+                </pic:pic>
+              </a:graphicData>
+            </a:graphic>
+          </wp:inline>
+        </w:drawing>
+      </w:r>
+    </w:p>
+    <w:p>
+      <w:r>
+        <w:rPr>
+          <w:noProof/>
+        </w:rPr>
         <w:drawing>
           <wp:inline distT="0" distB="0" distL="0" distR="0" wp14:anchorId="4C17D112" wp14:editId="48BC7B40">
             <wp:extent cx="4769095" cy="4388076"/>
@@ -3648,7 +3747,7 @@
                     <pic:cNvPicPr/>
                   </pic:nvPicPr>
                   <pic:blipFill>
-                    <a:blip r:embed="rId62"/>
+                    <a:blip r:embed="rId64"/>
                     <a:stretch>
                       <a:fillRect/>
                     </a:stretch>
@@ -3671,6 +3770,9 @@
     </w:p>
     <w:p>
       <w:r>
+        <w:rPr>
+          <w:noProof/>
+        </w:rPr>
         <w:lastRenderedPageBreak/>
         <w:drawing>
           <wp:inline distT="0" distB="0" distL="0" distR="0" wp14:anchorId="7CEAD5CD" wp14:editId="58190166">
@@ -3688,7 +3790,7 @@
                     <pic:cNvPicPr/>
                   </pic:nvPicPr>
                   <pic:blipFill>
-                    <a:blip r:embed="rId63"/>
+                    <a:blip r:embed="rId65"/>
                     <a:stretch>
                       <a:fillRect/>
                     </a:stretch>
@@ -3728,16 +3830,8 @@
         <w:rPr>
           <w:rFonts w:hint="eastAsia"/>
         </w:rPr>
-        <w:t xml:space="preserve">d4000 0000 </w:t>
-      </w:r>
-      <w:proofErr w:type="gramStart"/>
-      <w:r>
-        <w:rPr>
-          <w:rFonts w:hint="eastAsia"/>
-        </w:rPr>
-        <w:t>(h2625A00)</w:t>
-      </w:r>
-      <w:proofErr w:type="gramEnd"/>
+        <w:t>d4000 0000 (h2625A00)</w:t>
+      </w:r>
       <w:r>
         <w:rPr>
           <w:rFonts w:hint="eastAsia"/>
@@ -3746,30 +3840,17 @@
       </w:r>
     </w:p>
     <w:p>
-      <w:pPr>
-        <w:rPr>
-          <w:rFonts w:hint="eastAsia"/>
-        </w:rPr>
-      </w:pPr>
       <w:r>
         <w:rPr>
           <w:rFonts w:hint="eastAsia"/>
         </w:rPr>
         <w:t>信号源注入真实信号，</w:t>
       </w:r>
-      <w:proofErr w:type="spellStart"/>
-      <w:r>
-        <w:rPr>
-          <w:rFonts w:hint="eastAsia"/>
-        </w:rPr>
-        <w:t>power_out</w:t>
-      </w:r>
-      <w:proofErr w:type="spellEnd"/>
-      <w:r>
-        <w:rPr>
-          <w:rFonts w:hint="eastAsia"/>
-        </w:rPr>
-        <w:t xml:space="preserve"> = d400000 </w:t>
+      <w:r>
+        <w:rPr>
+          <w:rFonts w:hint="eastAsia"/>
+        </w:rPr>
+        <w:t xml:space="preserve">power_out = d400000 </w:t>
       </w:r>
       <w:r>
         <w:rPr>
@@ -3780,6 +3861,9 @@
     </w:p>
     <w:p>
       <w:r>
+        <w:rPr>
+          <w:noProof/>
+        </w:rPr>
         <w:drawing>
           <wp:inline distT="0" distB="0" distL="0" distR="0" wp14:anchorId="7FA40DF6" wp14:editId="53B89059">
             <wp:extent cx="2844946" cy="2559182"/>
@@ -3796,7 +3880,7 @@
                     <pic:cNvPicPr/>
                   </pic:nvPicPr>
                   <pic:blipFill>
-                    <a:blip r:embed="rId64"/>
+                    <a:blip r:embed="rId66"/>
                     <a:stretch>
                       <a:fillRect/>
                     </a:stretch>
@@ -3827,6 +3911,9 @@
     </w:p>
     <w:p>
       <w:r>
+        <w:rPr>
+          <w:noProof/>
+        </w:rPr>
         <w:lastRenderedPageBreak/>
         <w:drawing>
           <wp:inline distT="0" distB="0" distL="0" distR="0" wp14:anchorId="6A9E6454" wp14:editId="597BE7DF">
@@ -3844,7 +3931,7 @@
                     <pic:cNvPicPr/>
                   </pic:nvPicPr>
                   <pic:blipFill>
-                    <a:blip r:embed="rId65"/>
+                    <a:blip r:embed="rId67"/>
                     <a:stretch>
                       <a:fillRect/>
                     </a:stretch>
@@ -3867,6 +3954,9 @@
     </w:p>
     <w:p>
       <w:r>
+        <w:rPr>
+          <w:noProof/>
+        </w:rPr>
         <w:drawing>
           <wp:inline distT="0" distB="0" distL="0" distR="0" wp14:anchorId="1A6BB49E" wp14:editId="2746F5C7">
             <wp:extent cx="5274310" cy="3968750"/>
@@ -3883,7 +3973,7 @@
                     <pic:cNvPicPr/>
                   </pic:nvPicPr>
                   <pic:blipFill>
-                    <a:blip r:embed="rId66"/>
+                    <a:blip r:embed="rId68"/>
                     <a:stretch>
                       <a:fillRect/>
                     </a:stretch>
@@ -3938,6 +4028,9 @@
     </w:p>
     <w:p>
       <w:r>
+        <w:rPr>
+          <w:noProof/>
+        </w:rPr>
         <w:lastRenderedPageBreak/>
         <w:drawing>
           <wp:inline distT="0" distB="0" distL="0" distR="0" wp14:anchorId="62393E51" wp14:editId="49188B9E">
@@ -3955,7 +4048,7 @@
                     <pic:cNvPicPr/>
                   </pic:nvPicPr>
                   <pic:blipFill>
-                    <a:blip r:embed="rId67"/>
+                    <a:blip r:embed="rId69"/>
                     <a:stretch>
                       <a:fillRect/>
                     </a:stretch>
@@ -4020,20 +4113,12 @@
         <w:t>太低了！</w:t>
       </w:r>
     </w:p>
-    <w:p>
-      <w:pPr>
-        <w:rPr>
-          <w:rFonts w:hint="eastAsia"/>
-        </w:rPr>
-      </w:pPr>
-    </w:p>
-    <w:p>
-      <w:pPr>
-        <w:rPr>
-          <w:rFonts w:hint="eastAsia"/>
-        </w:rPr>
-      </w:pPr>
-      <w:r>
+    <w:p/>
+    <w:p>
+      <w:r>
+        <w:rPr>
+          <w:noProof/>
+        </w:rPr>
         <w:drawing>
           <wp:inline distT="0" distB="0" distL="0" distR="0" wp14:anchorId="42E3409E" wp14:editId="2332CA63">
             <wp:extent cx="4711942" cy="2692538"/>
@@ -4050,7 +4135,7 @@
                     <pic:cNvPicPr/>
                   </pic:nvPicPr>
                   <pic:blipFill>
-                    <a:blip r:embed="rId68"/>
+                    <a:blip r:embed="rId70"/>
                     <a:stretch>
                       <a:fillRect/>
                     </a:stretch>
@@ -4059,6 +4144,909 @@
                     <a:xfrm>
                       <a:off x="0" y="0"/>
                       <a:ext cx="4711942" cy="2692538"/>
+                    </a:xfrm>
+                    <a:prstGeom prst="rect">
+                      <a:avLst/>
+                    </a:prstGeom>
+                  </pic:spPr>
+                </pic:pic>
+              </a:graphicData>
+            </a:graphic>
+          </wp:inline>
+        </w:drawing>
+      </w:r>
+    </w:p>
+    <w:p>
+      <w:r>
+        <w:rPr>
+          <w:rFonts w:hint="eastAsia"/>
+        </w:rPr>
+        <w:t>灵敏度计算：</w:t>
+      </w:r>
+    </w:p>
+    <w:p/>
+    <w:p>
+      <w:r>
+        <w:rPr>
+          <w:rFonts w:hint="eastAsia"/>
+        </w:rPr>
+        <w:t>-174+10*log10(B)+SNR+NF=</w:t>
+      </w:r>
+      <w:r>
+        <w:t>-174+10*log10(105e6*1.35)+10</w:t>
+      </w:r>
+      <w:r>
+        <w:rPr>
+          <w:rFonts w:hint="eastAsia"/>
+        </w:rPr>
+        <w:t>+10</w:t>
+      </w:r>
+      <w:r>
+        <w:rPr>
+          <w:rFonts w:hint="eastAsia"/>
+        </w:rPr>
+        <w:t>≈</w:t>
+      </w:r>
+      <w:r>
+        <w:rPr>
+          <w:rFonts w:hint="eastAsia"/>
+        </w:rPr>
+        <w:t>-72dBm</w:t>
+      </w:r>
+    </w:p>
+    <w:p>
+      <w:r>
+        <w:rPr>
+          <w:rFonts w:hint="eastAsia"/>
+        </w:rPr>
+        <w:t>信号源：真实信号，设置为</w:t>
+      </w:r>
+      <w:r>
+        <w:rPr>
+          <w:rFonts w:hint="eastAsia"/>
+        </w:rPr>
+        <w:t>level -70dBm, PEP = -63.84dBm</w:t>
+      </w:r>
+    </w:p>
+    <w:p>
+      <w:r>
+        <w:rPr>
+          <w:rFonts w:hint="eastAsia"/>
+        </w:rPr>
+        <w:t>PEP</w:t>
+      </w:r>
+      <w:r>
+        <w:rPr>
+          <w:rFonts w:hint="eastAsia"/>
+        </w:rPr>
+        <w:t>：</w:t>
+      </w:r>
+      <w:r>
+        <w:rPr>
+          <w:rFonts w:hint="eastAsia"/>
+        </w:rPr>
+        <w:t xml:space="preserve">-73.84dBm </w:t>
+      </w:r>
+    </w:p>
+    <w:p>
+      <w:r>
+        <w:rPr>
+          <w:rFonts w:hint="eastAsia"/>
+        </w:rPr>
+        <w:t>LEVEL</w:t>
+      </w:r>
+      <w:r>
+        <w:rPr>
+          <w:rFonts w:hint="eastAsia"/>
+        </w:rPr>
+        <w:t>：</w:t>
+      </w:r>
+      <w:r>
+        <w:rPr>
+          <w:rFonts w:hint="eastAsia"/>
+        </w:rPr>
+        <w:t>-80dBm</w:t>
+      </w:r>
+    </w:p>
+    <w:p>
+      <w:r>
+        <w:rPr>
+          <w:rFonts w:hint="eastAsia"/>
+        </w:rPr>
+        <w:t>仍然可以解调</w:t>
+      </w:r>
+      <w:r>
+        <w:rPr>
+          <w:rFonts w:hint="eastAsia"/>
+        </w:rPr>
+        <w:t>，只不过星座图比较模糊</w:t>
+      </w:r>
+    </w:p>
+    <w:p>
+      <w:pPr>
+        <w:pStyle w:val="1"/>
+      </w:pPr>
+      <w:r>
+        <w:rPr>
+          <w:rFonts w:hint="eastAsia"/>
+        </w:rPr>
+        <w:lastRenderedPageBreak/>
+        <w:t>2026/7/29</w:t>
+      </w:r>
+    </w:p>
+    <w:p>
+      <w:r>
+        <w:rPr>
+          <w:rFonts w:hint="eastAsia"/>
+        </w:rPr>
+        <w:t>尝试对调宽带和窄带的接收链路</w:t>
+      </w:r>
+    </w:p>
+    <w:p>
+      <w:r>
+        <w:rPr>
+          <w:rFonts w:hint="eastAsia"/>
+        </w:rPr>
+        <w:t>通道</w:t>
+      </w:r>
+      <w:r>
+        <w:rPr>
+          <w:rFonts w:hint="eastAsia"/>
+        </w:rPr>
+        <w:t>1</w:t>
+      </w:r>
+      <w:r>
+        <w:rPr>
+          <w:rFonts w:hint="eastAsia"/>
+        </w:rPr>
+        <w:t>接收宽带（</w:t>
+      </w:r>
+      <w:r>
+        <w:rPr>
+          <w:rFonts w:hint="eastAsia"/>
+        </w:rPr>
+        <w:t>DDC</w:t>
+      </w:r>
+      <w:r>
+        <w:rPr>
+          <w:rFonts w:hint="eastAsia"/>
+        </w:rPr>
+        <w:t>带宽</w:t>
+      </w:r>
+      <w:r>
+        <w:rPr>
+          <w:rFonts w:hint="eastAsia"/>
+        </w:rPr>
+        <w:t>20M</w:t>
+      </w:r>
+      <w:r>
+        <w:rPr>
+          <w:rFonts w:hint="eastAsia"/>
+        </w:rPr>
+        <w:t>）</w:t>
+      </w:r>
+    </w:p>
+    <w:p>
+      <w:r>
+        <w:rPr>
+          <w:rFonts w:hint="eastAsia"/>
+        </w:rPr>
+        <w:t>通道</w:t>
+      </w:r>
+      <w:r>
+        <w:rPr>
+          <w:rFonts w:hint="eastAsia"/>
+        </w:rPr>
+        <w:t>2</w:t>
+      </w:r>
+      <w:r>
+        <w:rPr>
+          <w:rFonts w:hint="eastAsia"/>
+        </w:rPr>
+        <w:t>接收窄带（</w:t>
+      </w:r>
+      <w:r>
+        <w:rPr>
+          <w:rFonts w:hint="eastAsia"/>
+        </w:rPr>
+        <w:t>DDC</w:t>
+      </w:r>
+      <w:r>
+        <w:rPr>
+          <w:rFonts w:hint="eastAsia"/>
+        </w:rPr>
+        <w:t>带宽</w:t>
+      </w:r>
+      <w:r>
+        <w:rPr>
+          <w:rFonts w:hint="eastAsia"/>
+        </w:rPr>
+        <w:t>160M</w:t>
+      </w:r>
+      <w:r>
+        <w:rPr>
+          <w:rFonts w:hint="eastAsia"/>
+        </w:rPr>
+        <w:t>）</w:t>
+      </w:r>
+    </w:p>
+    <w:p/>
+    <w:p>
+      <w:r>
+        <w:rPr>
+          <w:rFonts w:hint="eastAsia"/>
+        </w:rPr>
+        <w:t>增加了两个</w:t>
+      </w:r>
+      <w:r>
+        <w:rPr>
+          <w:rFonts w:hint="eastAsia"/>
+        </w:rPr>
+        <w:t xml:space="preserve"> set  false</w:t>
+      </w:r>
+    </w:p>
+    <w:p>
+      <w:r>
+        <w:rPr>
+          <w:rFonts w:hint="eastAsia"/>
+        </w:rPr>
+        <w:t>把窄带复位引出来了</w:t>
+      </w:r>
+    </w:p>
+    <w:p/>
+    <w:p>
+      <w:r>
+        <w:rPr>
+          <w:rFonts w:hint="eastAsia"/>
+        </w:rPr>
+        <w:t>直接接入</w:t>
+      </w:r>
+      <w:r>
+        <w:rPr>
+          <w:rFonts w:hint="eastAsia"/>
+        </w:rPr>
+        <w:t>AD</w:t>
+      </w:r>
+      <w:r>
+        <w:rPr>
+          <w:rFonts w:hint="eastAsia"/>
+        </w:rPr>
+        <w:t>，</w:t>
+      </w:r>
+    </w:p>
+    <w:p>
+      <w:r>
+        <w:rPr>
+          <w:rFonts w:hint="eastAsia"/>
+        </w:rPr>
+        <w:t>宽带卡</w:t>
+      </w:r>
+      <w:r>
+        <w:rPr>
+          <w:rFonts w:hint="eastAsia"/>
+        </w:rPr>
+        <w:t>1</w:t>
+      </w:r>
+      <w:r>
+        <w:rPr>
+          <w:rFonts w:hint="eastAsia"/>
+        </w:rPr>
+        <w:t>灵敏度：</w:t>
+      </w:r>
+      <w:r>
+        <w:rPr>
+          <w:rFonts w:hint="eastAsia"/>
+        </w:rPr>
+        <w:t>PEP</w:t>
+      </w:r>
+      <w:r>
+        <w:rPr>
+          <w:rFonts w:hint="eastAsia"/>
+        </w:rPr>
+        <w:t>：</w:t>
+      </w:r>
+      <w:r>
+        <w:rPr>
+          <w:rFonts w:hint="eastAsia"/>
+        </w:rPr>
+        <w:t>-31.96dBm</w:t>
+      </w:r>
+      <w:r>
+        <w:rPr>
+          <w:rFonts w:hint="eastAsia"/>
+        </w:rPr>
+        <w:t>；</w:t>
+      </w:r>
+      <w:r>
+        <w:rPr>
+          <w:rFonts w:hint="eastAsia"/>
+        </w:rPr>
+        <w:t>LEVEL</w:t>
+      </w:r>
+      <w:r>
+        <w:rPr>
+          <w:rFonts w:hint="eastAsia"/>
+        </w:rPr>
+        <w:t>：</w:t>
+      </w:r>
+      <w:r>
+        <w:rPr>
+          <w:rFonts w:hint="eastAsia"/>
+        </w:rPr>
+        <w:t>-36dBm</w:t>
+      </w:r>
+    </w:p>
+    <w:p>
+      <w:r>
+        <w:rPr>
+          <w:rFonts w:hint="eastAsia"/>
+        </w:rPr>
+        <w:t>宽带卡</w:t>
+      </w:r>
+      <w:r>
+        <w:rPr>
+          <w:rFonts w:hint="eastAsia"/>
+        </w:rPr>
+        <w:t>2</w:t>
+      </w:r>
+      <w:r>
+        <w:rPr>
+          <w:rFonts w:hint="eastAsia"/>
+        </w:rPr>
+        <w:t>灵敏度：</w:t>
+      </w:r>
+      <w:r>
+        <w:rPr>
+          <w:rFonts w:hint="eastAsia"/>
+        </w:rPr>
+        <w:t>PEP</w:t>
+      </w:r>
+      <w:r>
+        <w:rPr>
+          <w:rFonts w:hint="eastAsia"/>
+        </w:rPr>
+        <w:t>：</w:t>
+      </w:r>
+      <w:r>
+        <w:rPr>
+          <w:rFonts w:hint="eastAsia"/>
+        </w:rPr>
+        <w:t>-31.96</w:t>
+      </w:r>
+      <w:r>
+        <w:rPr>
+          <w:rFonts w:hint="eastAsia"/>
+        </w:rPr>
+        <w:t>dBm</w:t>
+      </w:r>
+      <w:r>
+        <w:rPr>
+          <w:rFonts w:hint="eastAsia"/>
+        </w:rPr>
+        <w:t>；</w:t>
+      </w:r>
+      <w:r>
+        <w:rPr>
+          <w:rFonts w:hint="eastAsia"/>
+        </w:rPr>
+        <w:t>LEVEL</w:t>
+      </w:r>
+      <w:r>
+        <w:rPr>
+          <w:rFonts w:hint="eastAsia"/>
+        </w:rPr>
+        <w:t>：</w:t>
+      </w:r>
+      <w:r>
+        <w:rPr>
+          <w:rFonts w:hint="eastAsia"/>
+        </w:rPr>
+        <w:t>-36dBm</w:t>
+      </w:r>
+    </w:p>
+    <w:p/>
+    <w:p>
+      <w:r>
+        <w:rPr>
+          <w:rFonts w:hint="eastAsia"/>
+        </w:rPr>
+        <w:t>窄带卡</w:t>
+      </w:r>
+      <w:r>
+        <w:rPr>
+          <w:rFonts w:hint="eastAsia"/>
+        </w:rPr>
+        <w:t>1</w:t>
+      </w:r>
+      <w:r>
+        <w:rPr>
+          <w:rFonts w:hint="eastAsia"/>
+        </w:rPr>
+        <w:t>灵敏度：</w:t>
+      </w:r>
+      <w:r>
+        <w:rPr>
+          <w:rFonts w:hint="eastAsia"/>
+        </w:rPr>
+        <w:t>PEP</w:t>
+      </w:r>
+      <w:r>
+        <w:rPr>
+          <w:rFonts w:hint="eastAsia"/>
+        </w:rPr>
+        <w:t>：</w:t>
+      </w:r>
+      <w:r>
+        <w:rPr>
+          <w:rFonts w:hint="eastAsia"/>
+        </w:rPr>
+        <w:t>-14.03dBm</w:t>
+      </w:r>
+      <w:r>
+        <w:rPr>
+          <w:rFonts w:hint="eastAsia"/>
+        </w:rPr>
+        <w:t>，</w:t>
+      </w:r>
+      <w:r>
+        <w:rPr>
+          <w:rFonts w:hint="eastAsia"/>
+        </w:rPr>
+        <w:t>LEVEL</w:t>
+      </w:r>
+      <w:r>
+        <w:rPr>
+          <w:rFonts w:hint="eastAsia"/>
+        </w:rPr>
+        <w:t>：</w:t>
+      </w:r>
+      <w:r>
+        <w:rPr>
+          <w:rFonts w:hint="eastAsia"/>
+        </w:rPr>
+        <w:t>-18.00dBm</w:t>
+      </w:r>
+    </w:p>
+    <w:p>
+      <w:r>
+        <w:rPr>
+          <w:rFonts w:hint="eastAsia"/>
+        </w:rPr>
+        <w:t>窄带卡</w:t>
+      </w:r>
+      <w:r>
+        <w:rPr>
+          <w:rFonts w:hint="eastAsia"/>
+        </w:rPr>
+        <w:t>2</w:t>
+      </w:r>
+      <w:r>
+        <w:rPr>
+          <w:rFonts w:hint="eastAsia"/>
+        </w:rPr>
+        <w:t>灵敏度：</w:t>
+      </w:r>
+      <w:r>
+        <w:rPr>
+          <w:rFonts w:hint="eastAsia"/>
+        </w:rPr>
+        <w:t>PEP</w:t>
+      </w:r>
+      <w:r>
+        <w:rPr>
+          <w:rFonts w:hint="eastAsia"/>
+        </w:rPr>
+        <w:t>：</w:t>
+      </w:r>
+      <w:r>
+        <w:rPr>
+          <w:rFonts w:hint="eastAsia"/>
+        </w:rPr>
+        <w:t>-14.03dBm</w:t>
+      </w:r>
+      <w:r>
+        <w:rPr>
+          <w:rFonts w:hint="eastAsia"/>
+        </w:rPr>
+        <w:t>，</w:t>
+      </w:r>
+      <w:r>
+        <w:rPr>
+          <w:rFonts w:hint="eastAsia"/>
+        </w:rPr>
+        <w:t>LEVEL</w:t>
+      </w:r>
+      <w:r>
+        <w:rPr>
+          <w:rFonts w:hint="eastAsia"/>
+        </w:rPr>
+        <w:t>：</w:t>
+      </w:r>
+      <w:r>
+        <w:rPr>
+          <w:rFonts w:hint="eastAsia"/>
+        </w:rPr>
+        <w:t>-18.00dBm</w:t>
+      </w:r>
+    </w:p>
+    <w:p>
+      <w:pPr>
+        <w:rPr>
+          <w:rFonts w:hint="eastAsia"/>
+        </w:rPr>
+      </w:pPr>
+      <w:r>
+        <w:rPr>
+          <w:rFonts w:hint="eastAsia"/>
+        </w:rPr>
+        <w:t>调低</w:t>
+      </w:r>
+      <w:r>
+        <w:rPr>
+          <w:rFonts w:hint="eastAsia"/>
+        </w:rPr>
+        <w:t xml:space="preserve">noise power </w:t>
+      </w:r>
+      <w:r>
+        <w:rPr>
+          <w:rFonts w:hint="eastAsia"/>
+        </w:rPr>
+        <w:t>，</w:t>
+      </w:r>
+      <w:r>
+        <w:rPr>
+          <w:rFonts w:hint="eastAsia"/>
+        </w:rPr>
+        <w:t xml:space="preserve">TLL_LOCED_NUM </w:t>
+      </w:r>
+      <w:r>
+        <w:rPr>
+          <w:rFonts w:hint="eastAsia"/>
+        </w:rPr>
+        <w:t>改成</w:t>
+      </w:r>
+      <w:r>
+        <w:rPr>
+          <w:rFonts w:hint="eastAsia"/>
+        </w:rPr>
+        <w:t xml:space="preserve"> 0x300</w:t>
+      </w:r>
+      <w:r>
+        <w:rPr>
+          <w:rFonts w:hint="eastAsia"/>
+        </w:rPr>
+        <w:t>，</w:t>
+      </w:r>
+    </w:p>
+    <w:p>
+      <w:r>
+        <w:drawing>
+          <wp:inline distT="0" distB="0" distL="0" distR="0" wp14:anchorId="0F0FA2D0" wp14:editId="65E5CC98">
+            <wp:extent cx="4591286" cy="2787793"/>
+            <wp:effectExtent l="0" t="0" r="0" b="0"/>
+            <wp:docPr id="1511250554" name="图片 1"/>
+            <wp:cNvGraphicFramePr>
+              <a:graphicFrameLocks xmlns:a="http://schemas.openxmlformats.org/drawingml/2006/main" noChangeAspect="1"/>
+            </wp:cNvGraphicFramePr>
+            <a:graphic xmlns:a="http://schemas.openxmlformats.org/drawingml/2006/main">
+              <a:graphicData uri="http://schemas.openxmlformats.org/drawingml/2006/picture">
+                <pic:pic xmlns:pic="http://schemas.openxmlformats.org/drawingml/2006/picture">
+                  <pic:nvPicPr>
+                    <pic:cNvPr id="1511250554" name=""/>
+                    <pic:cNvPicPr/>
+                  </pic:nvPicPr>
+                  <pic:blipFill>
+                    <a:blip r:embed="rId71"/>
+                    <a:stretch>
+                      <a:fillRect/>
+                    </a:stretch>
+                  </pic:blipFill>
+                  <pic:spPr>
+                    <a:xfrm>
+                      <a:off x="0" y="0"/>
+                      <a:ext cx="4591286" cy="2787793"/>
+                    </a:xfrm>
+                    <a:prstGeom prst="rect">
+                      <a:avLst/>
+                    </a:prstGeom>
+                  </pic:spPr>
+                </pic:pic>
+              </a:graphicData>
+            </a:graphic>
+          </wp:inline>
+        </w:drawing>
+      </w:r>
+    </w:p>
+    <w:p/>
+    <w:p>
+      <w:r>
+        <w:rPr>
+          <w:rFonts w:hint="eastAsia"/>
+        </w:rPr>
+        <w:t>PEP</w:t>
+      </w:r>
+      <w:r>
+        <w:rPr>
+          <w:rFonts w:hint="eastAsia"/>
+        </w:rPr>
+        <w:t>：</w:t>
+      </w:r>
+      <w:r>
+        <w:rPr>
+          <w:rFonts w:hint="eastAsia"/>
+        </w:rPr>
+        <w:t>-40.03dBm</w:t>
+      </w:r>
+      <w:r>
+        <w:rPr>
+          <w:rFonts w:hint="eastAsia"/>
+        </w:rPr>
+        <w:t>，</w:t>
+      </w:r>
+      <w:r>
+        <w:rPr>
+          <w:rFonts w:hint="eastAsia"/>
+        </w:rPr>
+        <w:t>Level</w:t>
+      </w:r>
+      <w:r>
+        <w:rPr>
+          <w:rFonts w:hint="eastAsia"/>
+        </w:rPr>
+        <w:t>：</w:t>
+      </w:r>
+      <w:r>
+        <w:rPr>
+          <w:rFonts w:hint="eastAsia"/>
+        </w:rPr>
+        <w:t>-44dBm</w:t>
+      </w:r>
+      <w:r>
+        <w:rPr>
+          <w:rFonts w:hint="eastAsia"/>
+        </w:rPr>
+        <w:t>也行</w:t>
+      </w:r>
+    </w:p>
+    <w:p>
+      <w:r>
+        <w:rPr>
+          <w:rFonts w:hint="eastAsia"/>
+        </w:rPr>
+        <w:t>最低可以到</w:t>
+      </w:r>
+      <w:r>
+        <w:rPr>
+          <w:rFonts w:hint="eastAsia"/>
+        </w:rPr>
+        <w:t>-43.03dBm</w:t>
+      </w:r>
+      <w:r>
+        <w:rPr>
+          <w:rFonts w:hint="eastAsia"/>
+        </w:rPr>
+        <w:t>，</w:t>
+      </w:r>
+      <w:r>
+        <w:rPr>
+          <w:rFonts w:hint="eastAsia"/>
+        </w:rPr>
+        <w:t>Level</w:t>
+      </w:r>
+      <w:r>
+        <w:rPr>
+          <w:rFonts w:hint="eastAsia"/>
+        </w:rPr>
+        <w:t>：</w:t>
+      </w:r>
+      <w:r>
+        <w:rPr>
+          <w:rFonts w:hint="eastAsia"/>
+        </w:rPr>
+        <w:t>-47dBm</w:t>
+      </w:r>
+    </w:p>
+    <w:p>
+      <w:r>
+        <w:rPr>
+          <w:rFonts w:hint="eastAsia"/>
+        </w:rPr>
+        <w:t>显示的缓存实在是太多了！</w:t>
+      </w:r>
+      <w:r>
+        <w:rPr>
+          <w:rFonts w:hint="eastAsia"/>
+        </w:rPr>
+        <w:t>每次改完之后都很慢才刷新，要耐心的等待。</w:t>
+      </w:r>
+    </w:p>
+    <w:p/>
+    <w:p>
+      <w:r>
+        <w:rPr>
+          <w:rFonts w:hint="eastAsia"/>
+        </w:rPr>
+        <w:t>如果调低高速的噪声门限</w:t>
+      </w:r>
+    </w:p>
+    <w:p>
+      <w:r>
+        <w:lastRenderedPageBreak/>
+        <w:drawing>
+          <wp:inline distT="0" distB="0" distL="0" distR="0" wp14:anchorId="33CDBBEA" wp14:editId="76AED63F">
+            <wp:extent cx="4769095" cy="2463927"/>
+            <wp:effectExtent l="0" t="0" r="0" b="0"/>
+            <wp:docPr id="1774443171" name="图片 1"/>
+            <wp:cNvGraphicFramePr>
+              <a:graphicFrameLocks xmlns:a="http://schemas.openxmlformats.org/drawingml/2006/main" noChangeAspect="1"/>
+            </wp:cNvGraphicFramePr>
+            <a:graphic xmlns:a="http://schemas.openxmlformats.org/drawingml/2006/main">
+              <a:graphicData uri="http://schemas.openxmlformats.org/drawingml/2006/picture">
+                <pic:pic xmlns:pic="http://schemas.openxmlformats.org/drawingml/2006/picture">
+                  <pic:nvPicPr>
+                    <pic:cNvPr id="1774443171" name=""/>
+                    <pic:cNvPicPr/>
+                  </pic:nvPicPr>
+                  <pic:blipFill>
+                    <a:blip r:embed="rId72"/>
+                    <a:stretch>
+                      <a:fillRect/>
+                    </a:stretch>
+                  </pic:blipFill>
+                  <pic:spPr>
+                    <a:xfrm>
+                      <a:off x="0" y="0"/>
+                      <a:ext cx="4769095" cy="2463927"/>
+                    </a:xfrm>
+                    <a:prstGeom prst="rect">
+                      <a:avLst/>
+                    </a:prstGeom>
+                  </pic:spPr>
+                </pic:pic>
+              </a:graphicData>
+            </a:graphic>
+          </wp:inline>
+        </w:drawing>
+      </w:r>
+    </w:p>
+    <w:p>
+      <w:r>
+        <w:rPr>
+          <w:rFonts w:hint="eastAsia"/>
+        </w:rPr>
+        <w:t>基本可以到</w:t>
+      </w:r>
+      <w:r>
+        <w:rPr>
+          <w:rFonts w:hint="eastAsia"/>
+        </w:rPr>
+        <w:t>PEP</w:t>
+      </w:r>
+      <w:r>
+        <w:rPr>
+          <w:rFonts w:hint="eastAsia"/>
+        </w:rPr>
+        <w:t>：</w:t>
+      </w:r>
+      <w:r>
+        <w:rPr>
+          <w:rFonts w:hint="eastAsia"/>
+        </w:rPr>
+        <w:t>-49.96dBm</w:t>
+      </w:r>
+      <w:r>
+        <w:rPr>
+          <w:rFonts w:hint="eastAsia"/>
+        </w:rPr>
+        <w:t>，</w:t>
+      </w:r>
+      <w:r>
+        <w:rPr>
+          <w:rFonts w:hint="eastAsia"/>
+        </w:rPr>
+        <w:t xml:space="preserve"> LEVEL</w:t>
+      </w:r>
+      <w:r>
+        <w:rPr>
+          <w:rFonts w:hint="eastAsia"/>
+        </w:rPr>
+        <w:t>：</w:t>
+      </w:r>
+      <w:r>
+        <w:rPr>
+          <w:rFonts w:hint="eastAsia"/>
+        </w:rPr>
+        <w:t>-54dBm</w:t>
+      </w:r>
+    </w:p>
+    <w:p/>
+    <w:p>
+      <w:pPr>
+        <w:rPr>
+          <w:rFonts w:hint="eastAsia"/>
+        </w:rPr>
+      </w:pPr>
+      <w:r>
+        <w:rPr>
+          <w:rFonts w:hint="eastAsia"/>
+        </w:rPr>
+        <w:t>从有源功分给信号，可以到</w:t>
+      </w:r>
+      <w:r>
+        <w:rPr>
+          <w:rFonts w:hint="eastAsia"/>
+        </w:rPr>
+        <w:t>PEP</w:t>
+      </w:r>
+      <w:r>
+        <w:rPr>
+          <w:rFonts w:hint="eastAsia"/>
+        </w:rPr>
+        <w:t>：</w:t>
+      </w:r>
+      <w:r>
+        <w:rPr>
+          <w:rFonts w:hint="eastAsia"/>
+        </w:rPr>
+        <w:t>-94.03dBm</w:t>
+      </w:r>
+      <w:r>
+        <w:rPr>
+          <w:rFonts w:hint="eastAsia"/>
+        </w:rPr>
+        <w:t>，</w:t>
+      </w:r>
+      <w:r>
+        <w:rPr>
+          <w:rFonts w:hint="eastAsia"/>
+        </w:rPr>
+        <w:t>LEVEL</w:t>
+      </w:r>
+      <w:r>
+        <w:rPr>
+          <w:rFonts w:hint="eastAsia"/>
+        </w:rPr>
+        <w:t>：</w:t>
+      </w:r>
+      <w:r>
+        <w:rPr>
+          <w:rFonts w:hint="eastAsia"/>
+        </w:rPr>
+        <w:t>-98dBm</w:t>
+      </w:r>
+    </w:p>
+    <w:p>
+      <w:pPr>
+        <w:rPr>
+          <w:rFonts w:hint="eastAsia"/>
+        </w:rPr>
+      </w:pPr>
+      <w:r>
+        <w:drawing>
+          <wp:inline distT="0" distB="0" distL="0" distR="0" wp14:anchorId="082269AA" wp14:editId="2B3C5635">
+            <wp:extent cx="4521432" cy="2648086"/>
+            <wp:effectExtent l="0" t="0" r="0" b="0"/>
+            <wp:docPr id="1034110327" name="图片 1"/>
+            <wp:cNvGraphicFramePr>
+              <a:graphicFrameLocks xmlns:a="http://schemas.openxmlformats.org/drawingml/2006/main" noChangeAspect="1"/>
+            </wp:cNvGraphicFramePr>
+            <a:graphic xmlns:a="http://schemas.openxmlformats.org/drawingml/2006/main">
+              <a:graphicData uri="http://schemas.openxmlformats.org/drawingml/2006/picture">
+                <pic:pic xmlns:pic="http://schemas.openxmlformats.org/drawingml/2006/picture">
+                  <pic:nvPicPr>
+                    <pic:cNvPr id="1034110327" name=""/>
+                    <pic:cNvPicPr/>
+                  </pic:nvPicPr>
+                  <pic:blipFill>
+                    <a:blip r:embed="rId73"/>
+                    <a:stretch>
+                      <a:fillRect/>
+                    </a:stretch>
+                  </pic:blipFill>
+                  <pic:spPr>
+                    <a:xfrm>
+                      <a:off x="0" y="0"/>
+                      <a:ext cx="4521432" cy="2648086"/>
                     </a:xfrm>
                     <a:prstGeom prst="rect">
                       <a:avLst/>
@@ -4082,7 +5070,7 @@
 </file>
 
 <file path=word/endnotes.xml><?xml version="1.0" encoding="utf-8"?>
-<w:endnotes xmlns:wpc="http://schemas.microsoft.com/office/word/2010/wordprocessingCanvas" xmlns:cx="http://schemas.microsoft.com/office/drawing/2014/chartex" xmlns:cx1="http://schemas.microsoft.com/office/drawing/2015/9/8/chartex" xmlns:cx2="http://schemas.microsoft.com/office/drawing/2015/10/21/chartex" xmlns:cx3="http://schemas.microsoft.com/office/drawing/2016/5/9/chartex" xmlns:cx4="http://schemas.microsoft.com/office/drawing/2016/5/10/chartex" xmlns:cx5="http://schemas.microsoft.com/office/drawing/2016/5/11/chartex" xmlns:cx6="http://schemas.microsoft.com/office/drawing/2016/5/12/chartex" xmlns:cx7="http://schemas.microsoft.com/office/drawing/2016/5/13/chartex" xmlns:cx8="http://schemas.microsoft.com/office/drawing/2016/5/14/chartex" xmlns:mc="http://schemas.openxmlformats.org/markup-compatibility/2006" xmlns:aink="http://schemas.microsoft.com/office/drawing/2016/ink" xmlns:am3d="http://schemas.microsoft.com/office/drawing/2017/model3d" xmlns:o="urn:schemas-microsoft-com:office:office" xmlns:oel="http://schemas.microsoft.com/office/2019/extlst" xmlns:r="http://schemas.openxmlformats.org/officeDocument/2006/relationships" xmlns:m="http://schemas.openxmlformats.org/officeDocument/2006/math" xmlns:v="urn:schemas-microsoft-com:vml" xmlns:wp14="http://schemas.microsoft.com/office/word/2010/wordprocessingDrawing" xmlns:wp="http://schemas.openxmlformats.org/drawingml/2006/wordprocessingDrawing" xmlns:w10="urn:schemas-microsoft-com:office:word" xmlns:w="http://schemas.openxmlformats.org/wordprocessingml/2006/main" xmlns:w14="http://schemas.microsoft.com/office/word/2010/wordml" xmlns:w15="http://schemas.microsoft.com/office/word/2012/wordml" xmlns:w16cex="http://schemas.microsoft.com/office/word/2018/wordml/cex" xmlns:w16cid="http://schemas.microsoft.com/office/word/2016/wordml/cid" xmlns:w16="http://schemas.microsoft.com/office/word/2018/wordml" xmlns:w16du="http://schemas.microsoft.com/office/word/2023/wordml/word16du" xmlns:w16sdtdh="http://schemas.microsoft.com/office/word/2020/wordml/sdtdatahash" xmlns:w16sdtfl="http://schemas.microsoft.com/office/word/2024/wordml/sdtformatlock" xmlns:w16se="http://schemas.microsoft.com/office/word/2015/wordml/symex" xmlns:wpg="http://schemas.microsoft.com/office/word/2010/wordprocessingGroup" xmlns:wpi="http://schemas.microsoft.com/office/word/2010/wordprocessingInk" xmlns:wne="http://schemas.microsoft.com/office/word/2006/wordml" xmlns:wps="http://schemas.microsoft.com/office/word/2010/wordprocessingShape" mc:Ignorable="w14 w15 w16se w16cid w16 w16cex w16sdtdh w16sdtfl w16du wp14">
+<w:endnotes xmlns:wpc="http://schemas.microsoft.com/office/word/2010/wordprocessingCanvas" xmlns:cx="http://schemas.microsoft.com/office/drawing/2014/chartex" xmlns:cx1="http://schemas.microsoft.com/office/drawing/2015/9/8/chartex" xmlns:cx2="http://schemas.microsoft.com/office/drawing/2015/10/21/chartex" xmlns:cx3="http://schemas.microsoft.com/office/drawing/2016/5/9/chartex" xmlns:cx4="http://schemas.microsoft.com/office/drawing/2016/5/10/chartex" xmlns:cx5="http://schemas.microsoft.com/office/drawing/2016/5/11/chartex" xmlns:cx6="http://schemas.microsoft.com/office/drawing/2016/5/12/chartex" xmlns:cx7="http://schemas.microsoft.com/office/drawing/2016/5/13/chartex" xmlns:cx8="http://schemas.microsoft.com/office/drawing/2016/5/14/chartex" xmlns:mc="http://schemas.openxmlformats.org/markup-compatibility/2006" xmlns:aink="http://schemas.microsoft.com/office/drawing/2016/ink" xmlns:am3d="http://schemas.microsoft.com/office/drawing/2017/model3d" xmlns:o="urn:schemas-microsoft-com:office:office" xmlns:oel="http://schemas.microsoft.com/office/2019/extlst" xmlns:r="http://schemas.openxmlformats.org/officeDocument/2006/relationships" xmlns:m="http://schemas.openxmlformats.org/officeDocument/2006/math" xmlns:v="urn:schemas-microsoft-com:vml" xmlns:wp14="http://schemas.microsoft.com/office/word/2010/wordprocessingDrawing" xmlns:wp="http://schemas.openxmlformats.org/drawingml/2006/wordprocessingDrawing" xmlns:w10="urn:schemas-microsoft-com:office:word" xmlns:w="http://schemas.openxmlformats.org/wordprocessingml/2006/main" xmlns:w14="http://schemas.microsoft.com/office/word/2010/wordml" xmlns:w15="http://schemas.microsoft.com/office/word/2012/wordml" xmlns:w16cei="http://schemas.microsoft.com/office/word/2026/wordml/cei" xmlns:w16cex="http://schemas.microsoft.com/office/word/2018/wordml/cex" xmlns:w16cid="http://schemas.microsoft.com/office/word/2016/wordml/cid" xmlns:w16="http://schemas.microsoft.com/office/word/2018/wordml" xmlns:w16du="http://schemas.microsoft.com/office/word/2023/wordml/word16du" xmlns:w16sdtdh="http://schemas.microsoft.com/office/word/2020/wordml/sdtdatahash" xmlns:w16sdtfl="http://schemas.microsoft.com/office/word/2024/wordml/sdtformatlock" xmlns:w16se="http://schemas.microsoft.com/office/word/2015/wordml/symex" xmlns:wpg="http://schemas.microsoft.com/office/word/2010/wordprocessingGroup" xmlns:wpi="http://schemas.microsoft.com/office/word/2010/wordprocessingInk" xmlns:wne="http://schemas.microsoft.com/office/word/2006/wordml" xmlns:wps="http://schemas.microsoft.com/office/word/2010/wordprocessingShape" mc:Ignorable="w14 w15 w16se w16cid w16 w16cex w16sdtdh w16sdtfl w16du wp14">
   <w:endnote w:type="separator" w:id="-1">
     <w:p>
       <w:r>
@@ -4101,7 +5089,7 @@
 </file>
 
 <file path=word/footnotes.xml><?xml version="1.0" encoding="utf-8"?>
-<w:footnotes xmlns:wpc="http://schemas.microsoft.com/office/word/2010/wordprocessingCanvas" xmlns:cx="http://schemas.microsoft.com/office/drawing/2014/chartex" xmlns:cx1="http://schemas.microsoft.com/office/drawing/2015/9/8/chartex" xmlns:cx2="http://schemas.microsoft.com/office/drawing/2015/10/21/chartex" xmlns:cx3="http://schemas.microsoft.com/office/drawing/2016/5/9/chartex" xmlns:cx4="http://schemas.microsoft.com/office/drawing/2016/5/10/chartex" xmlns:cx5="http://schemas.microsoft.com/office/drawing/2016/5/11/chartex" xmlns:cx6="http://schemas.microsoft.com/office/drawing/2016/5/12/chartex" xmlns:cx7="http://schemas.microsoft.com/office/drawing/2016/5/13/chartex" xmlns:cx8="http://schemas.microsoft.com/office/drawing/2016/5/14/chartex" xmlns:mc="http://schemas.openxmlformats.org/markup-compatibility/2006" xmlns:aink="http://schemas.microsoft.com/office/drawing/2016/ink" xmlns:am3d="http://schemas.microsoft.com/office/drawing/2017/model3d" xmlns:o="urn:schemas-microsoft-com:office:office" xmlns:oel="http://schemas.microsoft.com/office/2019/extlst" xmlns:r="http://schemas.openxmlformats.org/officeDocument/2006/relationships" xmlns:m="http://schemas.openxmlformats.org/officeDocument/2006/math" xmlns:v="urn:schemas-microsoft-com:vml" xmlns:wp14="http://schemas.microsoft.com/office/word/2010/wordprocessingDrawing" xmlns:wp="http://schemas.openxmlformats.org/drawingml/2006/wordprocessingDrawing" xmlns:w10="urn:schemas-microsoft-com:office:word" xmlns:w="http://schemas.openxmlformats.org/wordprocessingml/2006/main" xmlns:w14="http://schemas.microsoft.com/office/word/2010/wordml" xmlns:w15="http://schemas.microsoft.com/office/word/2012/wordml" xmlns:w16cex="http://schemas.microsoft.com/office/word/2018/wordml/cex" xmlns:w16cid="http://schemas.microsoft.com/office/word/2016/wordml/cid" xmlns:w16="http://schemas.microsoft.com/office/word/2018/wordml" xmlns:w16du="http://schemas.microsoft.com/office/word/2023/wordml/word16du" xmlns:w16sdtdh="http://schemas.microsoft.com/office/word/2020/wordml/sdtdatahash" xmlns:w16sdtfl="http://schemas.microsoft.com/office/word/2024/wordml/sdtformatlock" xmlns:w16se="http://schemas.microsoft.com/office/word/2015/wordml/symex" xmlns:wpg="http://schemas.microsoft.com/office/word/2010/wordprocessingGroup" xmlns:wpi="http://schemas.microsoft.com/office/word/2010/wordprocessingInk" xmlns:wne="http://schemas.microsoft.com/office/word/2006/wordml" xmlns:wps="http://schemas.microsoft.com/office/word/2010/wordprocessingShape" mc:Ignorable="w14 w15 w16se w16cid w16 w16cex w16sdtdh w16sdtfl w16du wp14">
+<w:footnotes xmlns:wpc="http://schemas.microsoft.com/office/word/2010/wordprocessingCanvas" xmlns:cx="http://schemas.microsoft.com/office/drawing/2014/chartex" xmlns:cx1="http://schemas.microsoft.com/office/drawing/2015/9/8/chartex" xmlns:cx2="http://schemas.microsoft.com/office/drawing/2015/10/21/chartex" xmlns:cx3="http://schemas.microsoft.com/office/drawing/2016/5/9/chartex" xmlns:cx4="http://schemas.microsoft.com/office/drawing/2016/5/10/chartex" xmlns:cx5="http://schemas.microsoft.com/office/drawing/2016/5/11/chartex" xmlns:cx6="http://schemas.microsoft.com/office/drawing/2016/5/12/chartex" xmlns:cx7="http://schemas.microsoft.com/office/drawing/2016/5/13/chartex" xmlns:cx8="http://schemas.microsoft.com/office/drawing/2016/5/14/chartex" xmlns:mc="http://schemas.openxmlformats.org/markup-compatibility/2006" xmlns:aink="http://schemas.microsoft.com/office/drawing/2016/ink" xmlns:am3d="http://schemas.microsoft.com/office/drawing/2017/model3d" xmlns:o="urn:schemas-microsoft-com:office:office" xmlns:oel="http://schemas.microsoft.com/office/2019/extlst" xmlns:r="http://schemas.openxmlformats.org/officeDocument/2006/relationships" xmlns:m="http://schemas.openxmlformats.org/officeDocument/2006/math" xmlns:v="urn:schemas-microsoft-com:vml" xmlns:wp14="http://schemas.microsoft.com/office/word/2010/wordprocessingDrawing" xmlns:wp="http://schemas.openxmlformats.org/drawingml/2006/wordprocessingDrawing" xmlns:w10="urn:schemas-microsoft-com:office:word" xmlns:w="http://schemas.openxmlformats.org/wordprocessingml/2006/main" xmlns:w14="http://schemas.microsoft.com/office/word/2010/wordml" xmlns:w15="http://schemas.microsoft.com/office/word/2012/wordml" xmlns:w16cei="http://schemas.microsoft.com/office/word/2026/wordml/cei" xmlns:w16cex="http://schemas.microsoft.com/office/word/2018/wordml/cex" xmlns:w16cid="http://schemas.microsoft.com/office/word/2016/wordml/cid" xmlns:w16="http://schemas.microsoft.com/office/word/2018/wordml" xmlns:w16du="http://schemas.microsoft.com/office/word/2023/wordml/word16du" xmlns:w16sdtdh="http://schemas.microsoft.com/office/word/2020/wordml/sdtdatahash" xmlns:w16sdtfl="http://schemas.microsoft.com/office/word/2024/wordml/sdtformatlock" xmlns:w16se="http://schemas.microsoft.com/office/word/2015/wordml/symex" xmlns:wpg="http://schemas.microsoft.com/office/word/2010/wordprocessingGroup" xmlns:wpi="http://schemas.microsoft.com/office/word/2010/wordprocessingInk" xmlns:wne="http://schemas.microsoft.com/office/word/2006/wordml" xmlns:wps="http://schemas.microsoft.com/office/word/2010/wordprocessingShape" mc:Ignorable="w14 w15 w16se w16cid w16 w16cex w16sdtdh w16sdtfl w16du wp14">
   <w:footnote w:type="separator" w:id="-1">
     <w:p>
       <w:r>
@@ -4422,7 +5410,7 @@
   <w:style w:type="paragraph" w:default="1" w:styleId="a">
     <w:name w:val="Normal"/>
     <w:qFormat/>
-    <w:rsid w:val="006E2827"/>
+    <w:rsid w:val="000D72A9"/>
     <w:pPr>
       <w:widowControl w:val="0"/>
       <w:jc w:val="both"/>

</xml_diff>